<commit_message>
Modificare documentatie - etapa 2
</commit_message>
<xml_diff>
--- a/Documentatie.docx
+++ b/Documentatie.docx
@@ -778,56 +778,7 @@
             <w:rStyle w:val="Hyperlink"/>
             <w:rFonts w:ascii="Times New Roman" w:hAnsi="Times New Roman" w:cs="Times New Roman"/>
           </w:rPr>
-          <w:t>https://waltscom</w:t>
-        </w:r>
-        <w:r>
-          <w:rPr>
-            <w:rStyle w:val="Hyperlink"/>
-            <w:rFonts w:ascii="Times New Roman" w:hAnsi="Times New Roman" w:cs="Times New Roman"/>
-          </w:rPr>
-          <w:t>i</w:t>
-        </w:r>
-        <w:r>
-          <w:rPr>
-            <w:rStyle w:val="Hyperlink"/>
-            <w:rFonts w:ascii="Times New Roman" w:hAnsi="Times New Roman" w:cs="Times New Roman"/>
-          </w:rPr>
-          <w:t>csh</w:t>
-        </w:r>
-        <w:r>
-          <w:rPr>
-            <w:rStyle w:val="Hyperlink"/>
-            <w:rFonts w:ascii="Times New Roman" w:hAnsi="Times New Roman" w:cs="Times New Roman"/>
-          </w:rPr>
-          <w:t>o</w:t>
-        </w:r>
-        <w:r>
-          <w:rPr>
-            <w:rStyle w:val="Hyperlink"/>
-            <w:rFonts w:ascii="Times New Roman" w:hAnsi="Times New Roman" w:cs="Times New Roman"/>
-          </w:rPr>
-          <w:t>p</w:t>
-        </w:r>
-        <w:r>
-          <w:rPr>
-            <w:rStyle w:val="Hyperlink"/>
-            <w:rFonts w:ascii="Times New Roman" w:hAnsi="Times New Roman" w:cs="Times New Roman"/>
-          </w:rPr>
-          <w:t>.</w:t>
-        </w:r>
-        <w:r>
-          <w:rPr>
-            <w:rStyle w:val="Hyperlink"/>
-            <w:rFonts w:ascii="Times New Roman" w:hAnsi="Times New Roman" w:cs="Times New Roman"/>
-          </w:rPr>
-          <w:t>c</w:t>
-        </w:r>
-        <w:r>
-          <w:rPr>
-            <w:rStyle w:val="Hyperlink"/>
-            <w:rFonts w:ascii="Times New Roman" w:hAnsi="Times New Roman" w:cs="Times New Roman"/>
-          </w:rPr>
-          <w:t>om</w:t>
+          <w:t>https://waltscomicshop.com</w:t>
         </w:r>
       </w:hyperlink>
     </w:p>
@@ -951,21 +902,7 @@
             <w:rStyle w:val="Hyperlink"/>
             <w:rFonts w:ascii="Times New Roman" w:hAnsi="Times New Roman" w:cs="Times New Roman"/>
           </w:rPr>
-          <w:t>https://www.midt</w:t>
-        </w:r>
-        <w:r>
-          <w:rPr>
-            <w:rStyle w:val="Hyperlink"/>
-            <w:rFonts w:ascii="Times New Roman" w:hAnsi="Times New Roman" w:cs="Times New Roman"/>
-          </w:rPr>
-          <w:t>o</w:t>
-        </w:r>
-        <w:r>
-          <w:rPr>
-            <w:rStyle w:val="Hyperlink"/>
-            <w:rFonts w:ascii="Times New Roman" w:hAnsi="Times New Roman" w:cs="Times New Roman"/>
-          </w:rPr>
-          <w:t>wncomics.com</w:t>
+          <w:t>https://www.midtowncomics.com</w:t>
         </w:r>
       </w:hyperlink>
     </w:p>
@@ -1101,49 +1038,7 @@
             <w:rStyle w:val="Hyperlink"/>
             <w:rFonts w:ascii="Times New Roman" w:hAnsi="Times New Roman" w:cs="Times New Roman"/>
           </w:rPr>
-          <w:t>https://www.</w:t>
-        </w:r>
-        <w:r>
-          <w:rPr>
-            <w:rStyle w:val="Hyperlink"/>
-            <w:rFonts w:ascii="Times New Roman" w:hAnsi="Times New Roman" w:cs="Times New Roman"/>
-          </w:rPr>
-          <w:t>m</w:t>
-        </w:r>
-        <w:r>
-          <w:rPr>
-            <w:rStyle w:val="Hyperlink"/>
-            <w:rFonts w:ascii="Times New Roman" w:hAnsi="Times New Roman" w:cs="Times New Roman"/>
-          </w:rPr>
-          <w:t>an</w:t>
-        </w:r>
-        <w:r>
-          <w:rPr>
-            <w:rStyle w:val="Hyperlink"/>
-            <w:rFonts w:ascii="Times New Roman" w:hAnsi="Times New Roman" w:cs="Times New Roman"/>
-          </w:rPr>
-          <w:t>g</w:t>
-        </w:r>
-        <w:r>
-          <w:rPr>
-            <w:rStyle w:val="Hyperlink"/>
-            <w:rFonts w:ascii="Times New Roman" w:hAnsi="Times New Roman" w:cs="Times New Roman"/>
-          </w:rPr>
-          <w:t>asho</w:t>
-        </w:r>
-        <w:r>
-          <w:rPr>
-            <w:rStyle w:val="Hyperlink"/>
-            <w:rFonts w:ascii="Times New Roman" w:hAnsi="Times New Roman" w:cs="Times New Roman"/>
-          </w:rPr>
-          <w:t>p</w:t>
-        </w:r>
-        <w:r>
-          <w:rPr>
-            <w:rStyle w:val="Hyperlink"/>
-            <w:rFonts w:ascii="Times New Roman" w:hAnsi="Times New Roman" w:cs="Times New Roman"/>
-          </w:rPr>
-          <w:t>.ro</w:t>
+          <w:t>https://www.mangashop.ro</w:t>
         </w:r>
       </w:hyperlink>
     </w:p>
@@ -1290,21 +1185,7 @@
             <w:rStyle w:val="Hyperlink"/>
             <w:rFonts w:ascii="Times New Roman" w:hAnsi="Times New Roman" w:cs="Times New Roman"/>
           </w:rPr>
-          <w:t>https://shopcomic</w:t>
-        </w:r>
-        <w:r>
-          <w:rPr>
-            <w:rStyle w:val="Hyperlink"/>
-            <w:rFonts w:ascii="Times New Roman" w:hAnsi="Times New Roman" w:cs="Times New Roman"/>
-          </w:rPr>
-          <w:t>s</w:t>
-        </w:r>
-        <w:r>
-          <w:rPr>
-            <w:rStyle w:val="Hyperlink"/>
-            <w:rFonts w:ascii="Times New Roman" w:hAnsi="Times New Roman" w:cs="Times New Roman"/>
-          </w:rPr>
-          <w:t>.eu</w:t>
+          <w:t>https://shopcomics.eu</w:t>
         </w:r>
       </w:hyperlink>
     </w:p>
@@ -1433,21 +1314,7 @@
             <w:rStyle w:val="Hyperlink"/>
             <w:rFonts w:ascii="Times New Roman" w:hAnsi="Times New Roman" w:cs="Times New Roman"/>
           </w:rPr>
-          <w:t>https://forbiddenplan</w:t>
-        </w:r>
-        <w:r>
-          <w:rPr>
-            <w:rStyle w:val="Hyperlink"/>
-            <w:rFonts w:ascii="Times New Roman" w:hAnsi="Times New Roman" w:cs="Times New Roman"/>
-          </w:rPr>
-          <w:t>e</w:t>
-        </w:r>
-        <w:r>
-          <w:rPr>
-            <w:rStyle w:val="Hyperlink"/>
-            <w:rFonts w:ascii="Times New Roman" w:hAnsi="Times New Roman" w:cs="Times New Roman"/>
-          </w:rPr>
-          <w:t>t.com</w:t>
+          <w:t>https://forbiddenplanet.com</w:t>
         </w:r>
       </w:hyperlink>
     </w:p>
@@ -1534,6 +1401,131 @@
       </w:r>
     </w:p>
     <w:p/>
+    <w:p/>
+    <w:p/>
+    <w:p/>
+    <w:p/>
+    <w:p/>
+    <w:p/>
+    <w:p/>
+    <w:p>
+      <w:pPr>
+        <w:rPr>
+          <w:rFonts w:ascii="Times New Roman" w:hAnsi="Times New Roman" w:cs="Times New Roman"/>
+          <w:sz w:val="36"/>
+          <w:szCs w:val="36"/>
+        </w:rPr>
+      </w:pPr>
+      <w:r>
+        <w:rPr>
+          <w:rFonts w:ascii="Times New Roman" w:hAnsi="Times New Roman" w:cs="Times New Roman"/>
+          <w:sz w:val="36"/>
+          <w:szCs w:val="36"/>
+        </w:rPr>
+        <w:lastRenderedPageBreak/>
+        <w:t>Schema cromatică</w:t>
+      </w:r>
+    </w:p>
+    <w:p>
+      <w:pPr>
+        <w:jc w:val="center"/>
+        <w:rPr>
+          <w:noProof/>
+        </w:rPr>
+      </w:pPr>
+      <w:r>
+        <w:rPr>
+          <w:noProof/>
+        </w:rPr>
+        <w:drawing>
+          <wp:inline distT="0" distB="0" distL="0" distR="0" wp14:anchorId="50030DD5" wp14:editId="20367E38">
+            <wp:extent cx="4145280" cy="5653605"/>
+            <wp:effectExtent l="0" t="0" r="7620" b="4445"/>
+            <wp:docPr id="1" name="Picture 1"/>
+            <wp:cNvGraphicFramePr>
+              <a:graphicFrameLocks xmlns:a="http://schemas.openxmlformats.org/drawingml/2006/main" noChangeAspect="1"/>
+            </wp:cNvGraphicFramePr>
+            <a:graphic xmlns:a="http://schemas.openxmlformats.org/drawingml/2006/main">
+              <a:graphicData uri="http://schemas.openxmlformats.org/drawingml/2006/picture">
+                <pic:pic xmlns:pic="http://schemas.openxmlformats.org/drawingml/2006/picture">
+                  <pic:nvPicPr>
+                    <pic:cNvPr id="0" name="Picture 1"/>
+                    <pic:cNvPicPr>
+                      <a:picLocks noChangeAspect="1" noChangeArrowheads="1"/>
+                    </pic:cNvPicPr>
+                  </pic:nvPicPr>
+                  <pic:blipFill>
+                    <a:blip r:embed="rId10" cstate="print">
+                      <a:extLst>
+                        <a:ext uri="{28A0092B-C50C-407E-A947-70E740481C1C}">
+                          <a14:useLocalDpi xmlns:a14="http://schemas.microsoft.com/office/drawing/2010/main" val="0"/>
+                        </a:ext>
+                      </a:extLst>
+                    </a:blip>
+                    <a:srcRect/>
+                    <a:stretch>
+                      <a:fillRect/>
+                    </a:stretch>
+                  </pic:blipFill>
+                  <pic:spPr bwMode="auto">
+                    <a:xfrm>
+                      <a:off x="0" y="0"/>
+                      <a:ext cx="4147914" cy="5657197"/>
+                    </a:xfrm>
+                    <a:prstGeom prst="rect">
+                      <a:avLst/>
+                    </a:prstGeom>
+                    <a:noFill/>
+                    <a:ln>
+                      <a:noFill/>
+                    </a:ln>
+                  </pic:spPr>
+                </pic:pic>
+              </a:graphicData>
+            </a:graphic>
+          </wp:inline>
+        </w:drawing>
+      </w:r>
+    </w:p>
+    <w:p>
+      <w:pPr>
+        <w:rPr>
+          <w:noProof/>
+        </w:rPr>
+      </w:pPr>
+    </w:p>
+    <w:p>
+      <w:pPr>
+        <w:tabs>
+          <w:tab w:val="left" w:pos="3984"/>
+        </w:tabs>
+        <w:rPr>
+          <w:rFonts w:ascii="Times New Roman" w:hAnsi="Times New Roman" w:cs="Times New Roman"/>
+        </w:rPr>
+      </w:pPr>
+    </w:p>
+    <w:p>
+      <w:pPr>
+        <w:tabs>
+          <w:tab w:val="left" w:pos="3984"/>
+        </w:tabs>
+        <w:rPr>
+          <w:rFonts w:ascii="Times New Roman" w:hAnsi="Times New Roman" w:cs="Times New Roman"/>
+        </w:rPr>
+      </w:pPr>
+      <w:r>
+        <w:rPr>
+          <w:rFonts w:ascii="Times New Roman" w:hAnsi="Times New Roman" w:cs="Times New Roman"/>
+        </w:rPr>
+        <w:t>Am ales ca axă vizuală albastrul central, o culoare nobilă care sugerează nu doar aventura și profunzimea universurilor fantastice, ci și stabilitatea și încrederea necesare unei platforme de lectură</w:t>
+      </w:r>
+      <w:r>
+        <w:rPr>
+          <w:rFonts w:ascii="Times New Roman" w:hAnsi="Times New Roman" w:cs="Times New Roman"/>
+        </w:rPr>
+        <w:t>. Complementaritatea introdusă prin culorile calde (auriu) oferă acel element surpriză și dinamismul vizual specific esteticii benzilor desenate.</w:t>
+      </w:r>
+    </w:p>
     <w:p/>
     <w:sectPr>
       <w:pgSz w:w="11906" w:h="16838"/>

</xml_diff>